<commit_message>
docs/54, 61, 62: check the portal and the panel with a GET, not curl -I
The first page answers GET only, so curl -I (a HEAD) shows 404 on a working site. Found on the first trial
install of 1.0.8. No release.

Co-Authored-By: Claude Opus 5.5 <noreply@anthropic.com>
Claude-Session: https://claude.ai/code/session_012HHcRrzuvMBTL2FYxXtsyv
</commit_message>
<xml_diff>
--- a/treasury-platform/docs/61-BEGINNER-SERVER-INSTALL.docx
+++ b/treasury-platform/docs/61-BEGINNER-SERVER-INSTALL.docx
@@ -41589,7 +41589,7 @@
           <w:szCs w:val="17"/>
           <w:rtl w:val="false"/>
         </w:rPr>
-        <w:t xml:space="preserve">curl -sI https://admin.&lt;DOMAIN&gt;/</w:t>
+        <w:t xml:space="preserve">curl -s -o /dev/null -w '%{http_code}\n' https://admin.&lt;DOMAIN&gt;/</w:t>
       </w:r>
     </w:p>
     <w:p>
@@ -41606,7 +41606,7 @@
           <w:szCs w:val="21"/>
           <w:rtl/>
         </w:rPr>
-        <w:t xml:space="preserve">ما يجب أن تراه في أول سطر: </w:t>
+        <w:t xml:space="preserve">ما يجب أن تراه: </w:t>
       </w:r>
       <w:r>
         <w:rPr>
@@ -41619,7 +41619,7 @@
           <w:shd w:fill="F1F3F5" w:color="auto" w:val="clear"/>
           <w:rtl/>
         </w:rPr>
-        <w:t xml:space="preserve">‎HTTP/2 200‎</w:t>
+        <w:t xml:space="preserve">‎200‎</w:t>
       </w:r>
       <w:r>
         <w:rPr>
@@ -41930,7 +41930,7 @@
                 <w:shd w:fill="F1F3F5" w:color="auto" w:val="clear"/>
                 <w:rtl/>
               </w:rPr>
-              <w:t xml:space="preserve">‎HTTP/2 502‎</w:t>
+              <w:t xml:space="preserve">‎502‎</w:t>
             </w:r>
           </w:p>
         </w:tc>

</xml_diff>